<commit_message>
Add SEO metadata, fact-check citations, and infographic briefs
- Embedded full SEO block (title, slug, meta description, focus + secondary + LSI keywords, image alt) at the top of all 25 articles

- Fact-checked every statistic against EPA, CDC, USGS, NOAA, NSF, and the 2024 PNAS bottled-water study; corrected private-well figure to CDC's 15M+ households

- New companion doc (MD + DOCX): per-article verified claims with sources to hyperlink + anchor text, plus 25 detailed infographic design briefs

- Updated build_blog_docx.py to generate both DOCX deliverables
</commit_message>
<xml_diff>
--- a/WellnessWater-25-Pillar-Blog-Content.docx
+++ b/WellnessWater-25-Pillar-Blog-Content.docx
@@ -477,9 +477,85 @@
     <w:p>
       <w:r>
         <w:rPr>
-          <w:i/>
-        </w:rPr>
-        <w:t xml:space="preserve">Focus keyword: how to remove PFAS from drinking water • Meta description: PFAS "forever chemicals" are in tap and well water across the U.S. Learn the health risks, the new EPA limits, and the filtration that actually removes them.</w:t>
+          <w:b/>
+        </w:rPr>
+        <w:t xml:space="preserve">SEO Title:</w:t>
+      </w:r>
+      <w:r>
+        <w:rPr/>
+        <w:t xml:space="preserve"> PFAS in Drinking Water: How to Remove Forever Chemicals </w:t>
+      </w:r>
+      <w:r>
+        <w:rPr>
+          <w:b/>
+        </w:rPr>
+        <w:t xml:space="preserve">URL Slug:</w:t>
+      </w:r>
+      <w:r>
+        <w:rPr/>
+        <w:t xml:space="preserve"> </w:t>
+      </w:r>
+      <w:r>
+        <w:rPr>
+          <w:rFonts w:ascii="Consolas" w:hAnsi="Consolas"/>
+          <w:sz w:val="20"/>
+          <w:shd w:val="clear" w:color="auto" w:fill="F2F2F2"/>
+        </w:rPr>
+        <w:t xml:space="preserve">/pfas-forever-chemicals-drinking-water-removal-guide</w:t>
+      </w:r>
+      <w:r>
+        <w:rPr/>
+        <w:t xml:space="preserve"> </w:t>
+      </w:r>
+      <w:r>
+        <w:rPr>
+          <w:b/>
+        </w:rPr>
+        <w:t xml:space="preserve">Meta Description:</w:t>
+      </w:r>
+      <w:r>
+        <w:rPr/>
+        <w:t xml:space="preserve"> PFAS "forever chemicals" are in U.S. tap and well water. Learn the health risks, the 2024 EPA limits, and the filtration that actually removes them. </w:t>
+      </w:r>
+      <w:r>
+        <w:rPr>
+          <w:b/>
+        </w:rPr>
+        <w:t xml:space="preserve">Focus Keyword:</w:t>
+      </w:r>
+      <w:r>
+        <w:rPr/>
+        <w:t xml:space="preserve"> how to remove PFAS from drinking water </w:t>
+      </w:r>
+      <w:r>
+        <w:rPr>
+          <w:b/>
+        </w:rPr>
+        <w:t xml:space="preserve">Secondary Keywords:</w:t>
+      </w:r>
+      <w:r>
+        <w:rPr/>
+        <w:t xml:space="preserve"> PFAS in tap water, forever chemicals water filter, PFOA PFOS removal, does reverse osmosis remove PFAS, EPA PFAS limit </w:t>
+      </w:r>
+      <w:r>
+        <w:rPr>
+          <w:b/>
+        </w:rPr>
+        <w:t xml:space="preserve">LSI / Semantic Keywords:</w:t>
+      </w:r>
+      <w:r>
+        <w:rPr/>
+        <w:t xml:space="preserve"> parts per trillion, activated carbon, GenX, drinking water health advisory, bioaccumulation, point-of-use filtration </w:t>
+      </w:r>
+      <w:r>
+        <w:rPr>
+          <w:b/>
+        </w:rPr>
+        <w:t xml:space="preserve">Image Alt Text:</w:t>
+      </w:r>
+      <w:r>
+        <w:rPr/>
+        <w:t xml:space="preserve"> Diagram showing how PFAS forever chemicals travel from industrial sources into U.S. drinking water and which filters remove them</w:t>
       </w:r>
     </w:p>
     <w:p>
@@ -1373,9 +1449,85 @@
     <w:p>
       <w:r>
         <w:rPr>
-          <w:i/>
-        </w:rPr>
-        <w:t xml:space="preserve">Focus keyword: how to read water quality report • Meta description: Your annual Consumer Confidence Report is confusing on purpose. We decode every section — MCLs, detected contaminants, and what "within limits" really means for your family.</w:t>
+          <w:b/>
+        </w:rPr>
+        <w:t xml:space="preserve">SEO Title:</w:t>
+      </w:r>
+      <w:r>
+        <w:rPr/>
+        <w:t xml:space="preserve"> How to Read Your Water Quality Report (CCR Guide) </w:t>
+      </w:r>
+      <w:r>
+        <w:rPr>
+          <w:b/>
+        </w:rPr>
+        <w:t xml:space="preserve">URL Slug:</w:t>
+      </w:r>
+      <w:r>
+        <w:rPr/>
+        <w:t xml:space="preserve"> </w:t>
+      </w:r>
+      <w:r>
+        <w:rPr>
+          <w:rFonts w:ascii="Consolas" w:hAnsi="Consolas"/>
+          <w:sz w:val="20"/>
+          <w:shd w:val="clear" w:color="auto" w:fill="F2F2F2"/>
+        </w:rPr>
+        <w:t xml:space="preserve">/how-to-read-annual-water-quality-report-ccr</w:t>
+      </w:r>
+      <w:r>
+        <w:rPr/>
+        <w:t xml:space="preserve"> </w:t>
+      </w:r>
+      <w:r>
+        <w:rPr>
+          <w:b/>
+        </w:rPr>
+        <w:t xml:space="preserve">Meta Description:</w:t>
+      </w:r>
+      <w:r>
+        <w:rPr/>
+        <w:t xml:space="preserve"> Your annual Consumer Confidence Report is confusing on purpose. We decode every section — MCLs, contaminants, and what "within limits" really means. </w:t>
+      </w:r>
+      <w:r>
+        <w:rPr>
+          <w:b/>
+        </w:rPr>
+        <w:t xml:space="preserve">Focus Keyword:</w:t>
+      </w:r>
+      <w:r>
+        <w:rPr/>
+        <w:t xml:space="preserve"> how to read water quality report </w:t>
+      </w:r>
+      <w:r>
+        <w:rPr>
+          <w:b/>
+        </w:rPr>
+        <w:t xml:space="preserve">Secondary Keywords:</w:t>
+      </w:r>
+      <w:r>
+        <w:rPr/>
+        <w:t xml:space="preserve"> consumer confidence report explained, CCR water report, is my tap water safe, understanding water test results </w:t>
+      </w:r>
+      <w:r>
+        <w:rPr>
+          <w:b/>
+        </w:rPr>
+        <w:t xml:space="preserve">LSI / Semantic Keywords:</w:t>
+      </w:r>
+      <w:r>
+        <w:rPr/>
+        <w:t xml:space="preserve"> MCL maximum contaminant level, MCLG, ppm vs ppb, trihalomethanes, disinfection byproducts, EPA primary standards </w:t>
+      </w:r>
+      <w:r>
+        <w:rPr>
+          <w:b/>
+        </w:rPr>
+        <w:t xml:space="preserve">Image Alt Text:</w:t>
+      </w:r>
+      <w:r>
+        <w:rPr/>
+        <w:t xml:space="preserve"> Annotated sample U.S. water quality report (CCR) explaining the MCL, MCLG, and contaminant columns in plain English</w:t>
       </w:r>
     </w:p>
     <w:p>
@@ -1981,9 +2133,85 @@
     <w:p>
       <w:r>
         <w:rPr>
-          <w:i/>
-        </w:rPr>
-        <w:t xml:space="preserve">Focus keyword: well water testing guide • Meta description: The EPA doesn't regulate private wells — you do. Here's exactly what to test for, how often, and how to treat the most common well water problems in U.S. homes.</w:t>
+          <w:b/>
+        </w:rPr>
+        <w:t xml:space="preserve">SEO Title:</w:t>
+      </w:r>
+      <w:r>
+        <w:rPr/>
+        <w:t xml:space="preserve"> Well Water Testing Guide: 15 Things to Test For </w:t>
+      </w:r>
+      <w:r>
+        <w:rPr>
+          <w:b/>
+        </w:rPr>
+        <w:t xml:space="preserve">URL Slug:</w:t>
+      </w:r>
+      <w:r>
+        <w:rPr/>
+        <w:t xml:space="preserve"> </w:t>
+      </w:r>
+      <w:r>
+        <w:rPr>
+          <w:rFonts w:ascii="Consolas" w:hAnsi="Consolas"/>
+          <w:sz w:val="20"/>
+          <w:shd w:val="clear" w:color="auto" w:fill="F2F2F2"/>
+        </w:rPr>
+        <w:t xml:space="preserve">/well-water-testing-guide-what-to-test-for</w:t>
+      </w:r>
+      <w:r>
+        <w:rPr/>
+        <w:t xml:space="preserve"> </w:t>
+      </w:r>
+      <w:r>
+        <w:rPr>
+          <w:b/>
+        </w:rPr>
+        <w:t xml:space="preserve">Meta Description:</w:t>
+      </w:r>
+      <w:r>
+        <w:rPr/>
+        <w:t xml:space="preserve"> The EPA doesn't regulate private wells — you do. Here's exactly what to test for, how often, and how to treat common U.S. well water problems. </w:t>
+      </w:r>
+      <w:r>
+        <w:rPr>
+          <w:b/>
+        </w:rPr>
+        <w:t xml:space="preserve">Focus Keyword:</w:t>
+      </w:r>
+      <w:r>
+        <w:rPr/>
+        <w:t xml:space="preserve"> well water testing guide </w:t>
+      </w:r>
+      <w:r>
+        <w:rPr>
+          <w:b/>
+        </w:rPr>
+        <w:t xml:space="preserve">Secondary Keywords:</w:t>
+      </w:r>
+      <w:r>
+        <w:rPr/>
+        <w:t xml:space="preserve"> what to test well water for, private well water contaminants, how often to test well water, well water test kit </w:t>
+      </w:r>
+      <w:r>
+        <w:rPr>
+          <w:b/>
+        </w:rPr>
+        <w:t xml:space="preserve">LSI / Semantic Keywords:</w:t>
+      </w:r>
+      <w:r>
+        <w:rPr/>
+        <w:t xml:space="preserve"> coliform bacteria, nitrates, total dissolved solids, iron and manganese, hydrogen sulfide, arsenic, pH, hardness </w:t>
+      </w:r>
+      <w:r>
+        <w:rPr>
+          <w:b/>
+        </w:rPr>
+        <w:t xml:space="preserve">Image Alt Text:</w:t>
+      </w:r>
+      <w:r>
+        <w:rPr/>
+        <w:t xml:space="preserve"> Private well water testing checklist showing 15 contaminants to test for and how often, color-coded by health and nuisance issues</w:t>
       </w:r>
     </w:p>
     <w:p>
@@ -2005,7 +2233,7 @@
     <w:p>
       <w:r>
         <w:rPr/>
-        <w:t xml:space="preserve">That's not a reason for anxiety — it's a reason for a checklist. Here's exactly what to test for and how often.</w:t>
+        <w:t xml:space="preserve">More than 15 million U.S. households rely on private wells (CDC) — and that's not a reason for anxiety, it's a reason for a checklist. Here's exactly what to test for and how often.</w:t>
       </w:r>
     </w:p>
     <w:p>
@@ -3038,9 +3266,85 @@
     <w:p>
       <w:r>
         <w:rPr>
-          <w:i/>
-        </w:rPr>
-        <w:t xml:space="preserve">Focus keyword: microplastics in drinking water • Meta description: From tap to bottled, microplastics are everywhere in our water. Here's what current research shows, what we still don't know, and the filtration that removes them.</w:t>
+          <w:b/>
+        </w:rPr>
+        <w:t xml:space="preserve">SEO Title:</w:t>
+      </w:r>
+      <w:r>
+        <w:rPr/>
+        <w:t xml:space="preserve"> Microplastics in Drinking Water: Science &amp; Filtration </w:t>
+      </w:r>
+      <w:r>
+        <w:rPr>
+          <w:b/>
+        </w:rPr>
+        <w:t xml:space="preserve">URL Slug:</w:t>
+      </w:r>
+      <w:r>
+        <w:rPr/>
+        <w:t xml:space="preserve"> </w:t>
+      </w:r>
+      <w:r>
+        <w:rPr>
+          <w:rFonts w:ascii="Consolas" w:hAnsi="Consolas"/>
+          <w:sz w:val="20"/>
+          <w:shd w:val="clear" w:color="auto" w:fill="F2F2F2"/>
+        </w:rPr>
+        <w:t xml:space="preserve">/microplastics-in-drinking-water-filtration</w:t>
+      </w:r>
+      <w:r>
+        <w:rPr/>
+        <w:t xml:space="preserve"> </w:t>
+      </w:r>
+      <w:r>
+        <w:rPr>
+          <w:b/>
+        </w:rPr>
+        <w:t xml:space="preserve">Meta Description:</w:t>
+      </w:r>
+      <w:r>
+        <w:rPr/>
+        <w:t xml:space="preserve"> From tap to bottled, microplastics are everywhere. Here's what the research shows, what we don't yet know, and the filtration that removes them. </w:t>
+      </w:r>
+      <w:r>
+        <w:rPr>
+          <w:b/>
+        </w:rPr>
+        <w:t xml:space="preserve">Focus Keyword:</w:t>
+      </w:r>
+      <w:r>
+        <w:rPr/>
+        <w:t xml:space="preserve"> microplastics in drinking water </w:t>
+      </w:r>
+      <w:r>
+        <w:rPr>
+          <w:b/>
+        </w:rPr>
+        <w:t xml:space="preserve">Secondary Keywords:</w:t>
+      </w:r>
+      <w:r>
+        <w:rPr/>
+        <w:t xml:space="preserve"> how to remove microplastics from water, nanoplastics tap water, microplastics water filter, plastic in bottled water </w:t>
+      </w:r>
+      <w:r>
+        <w:rPr>
+          <w:b/>
+        </w:rPr>
+        <w:t xml:space="preserve">LSI / Semantic Keywords:</w:t>
+      </w:r>
+      <w:r>
+        <w:rPr/>
+        <w:t xml:space="preserve"> polymer particles, micron rating, reverse osmosis membrane, ingestion exposure, PNAS bottled water study </w:t>
+      </w:r>
+      <w:r>
+        <w:rPr>
+          <w:b/>
+        </w:rPr>
+        <w:t xml:space="preserve">Image Alt Text:</w:t>
+      </w:r>
+      <w:r>
+        <w:rPr/>
+        <w:t xml:space="preserve"> Scale comparison of a human hair, microplastic, and nanoplastic next to filter pore sizes that capture each</w:t>
       </w:r>
     </w:p>
     <w:p>
@@ -3421,9 +3725,85 @@
     <w:p>
       <w:r>
         <w:rPr>
-          <w:i/>
-        </w:rPr>
-        <w:t xml:space="preserve">Focus keyword: heavy metals in drinking water • Meta description: Heavy metals and farm chemicals contaminate water nationwide. Understand the sources, real health risks, and which filtration removes arsenic, chromium-6, nitrates, and lead.</w:t>
+          <w:b/>
+        </w:rPr>
+        <w:t xml:space="preserve">SEO Title:</w:t>
+      </w:r>
+      <w:r>
+        <w:rPr/>
+        <w:t xml:space="preserve"> Arsenic, Chromium-6, Nitrates &amp; Lead in U.S. Water </w:t>
+      </w:r>
+      <w:r>
+        <w:rPr>
+          <w:b/>
+        </w:rPr>
+        <w:t xml:space="preserve">URL Slug:</w:t>
+      </w:r>
+      <w:r>
+        <w:rPr/>
+        <w:t xml:space="preserve"> </w:t>
+      </w:r>
+      <w:r>
+        <w:rPr>
+          <w:rFonts w:ascii="Consolas" w:hAnsi="Consolas"/>
+          <w:sz w:val="20"/>
+          <w:shd w:val="clear" w:color="auto" w:fill="F2F2F2"/>
+        </w:rPr>
+        <w:t xml:space="preserve">/heavy-metals-nitrates-arsenic-chromium-lead-in-water</w:t>
+      </w:r>
+      <w:r>
+        <w:rPr/>
+        <w:t xml:space="preserve"> </w:t>
+      </w:r>
+      <w:r>
+        <w:rPr>
+          <w:b/>
+        </w:rPr>
+        <w:t xml:space="preserve">Meta Description:</w:t>
+      </w:r>
+      <w:r>
+        <w:rPr/>
+        <w:t xml:space="preserve"> Heavy metals and farm chemicals contaminate U.S. water. Learn the sources, health risks, and which filtration removes arsenic, chromium-6, nitrates, and lead. </w:t>
+      </w:r>
+      <w:r>
+        <w:rPr>
+          <w:b/>
+        </w:rPr>
+        <w:t xml:space="preserve">Focus Keyword:</w:t>
+      </w:r>
+      <w:r>
+        <w:rPr/>
+        <w:t xml:space="preserve"> heavy metals in drinking water </w:t>
+      </w:r>
+      <w:r>
+        <w:rPr>
+          <w:b/>
+        </w:rPr>
+        <w:t xml:space="preserve">Secondary Keywords:</w:t>
+      </w:r>
+      <w:r>
+        <w:rPr/>
+        <w:t xml:space="preserve"> arsenic in well water, chromium 6 in tap water, nitrates in drinking water, lead in tap water removal </w:t>
+      </w:r>
+      <w:r>
+        <w:rPr>
+          <w:b/>
+        </w:rPr>
+        <w:t xml:space="preserve">LSI / Semantic Keywords:</w:t>
+      </w:r>
+      <w:r>
+        <w:rPr/>
+        <w:t xml:space="preserve"> hexavalent chromium, agricultural runoff, methemoglobinemia, lead service lines, reverse osmosis heavy metals, EPA action level </w:t>
+      </w:r>
+      <w:r>
+        <w:rPr>
+          <w:b/>
+        </w:rPr>
+        <w:t xml:space="preserve">Image Alt Text:</w:t>
+      </w:r>
+      <w:r>
+        <w:rPr/>
+        <w:t xml:space="preserve"> Comparison chart of arsenic, chromium-6, nitrates, and lead in water showing source, health risk, and filtration fix for each</w:t>
       </w:r>
     </w:p>
     <w:p>
@@ -4012,9 +4392,85 @@
     <w:p>
       <w:r>
         <w:rPr>
-          <w:i/>
-        </w:rPr>
-        <w:t xml:space="preserve">Focus keyword: hard water map United States • Meta description: See how hard your state's water is, what "grains per gallon" means, and why hardness wrecks appliances and skin — plus how to soften it for good.</w:t>
+          <w:b/>
+        </w:rPr>
+        <w:t xml:space="preserve">SEO Title:</w:t>
+      </w:r>
+      <w:r>
+        <w:rPr/>
+        <w:t xml:space="preserve"> Hard Water Map of America: Hardness by State </w:t>
+      </w:r>
+      <w:r>
+        <w:rPr>
+          <w:b/>
+        </w:rPr>
+        <w:t xml:space="preserve">URL Slug:</w:t>
+      </w:r>
+      <w:r>
+        <w:rPr/>
+        <w:t xml:space="preserve"> </w:t>
+      </w:r>
+      <w:r>
+        <w:rPr>
+          <w:rFonts w:ascii="Consolas" w:hAnsi="Consolas"/>
+          <w:sz w:val="20"/>
+          <w:shd w:val="clear" w:color="auto" w:fill="F2F2F2"/>
+        </w:rPr>
+        <w:t xml:space="preserve">/hard-water-map-united-states-by-state</w:t>
+      </w:r>
+      <w:r>
+        <w:rPr/>
+        <w:t xml:space="preserve"> </w:t>
+      </w:r>
+      <w:r>
+        <w:rPr>
+          <w:b/>
+        </w:rPr>
+        <w:t xml:space="preserve">Meta Description:</w:t>
+      </w:r>
+      <w:r>
+        <w:rPr/>
+        <w:t xml:space="preserve"> See how hard your state's water is, what "grains per gallon" means, and why hardness wrecks appliances and skin — plus how to soften it for good. </w:t>
+      </w:r>
+      <w:r>
+        <w:rPr>
+          <w:b/>
+        </w:rPr>
+        <w:t xml:space="preserve">Focus Keyword:</w:t>
+      </w:r>
+      <w:r>
+        <w:rPr/>
+        <w:t xml:space="preserve"> hard water map United States </w:t>
+      </w:r>
+      <w:r>
+        <w:rPr>
+          <w:b/>
+        </w:rPr>
+        <w:t xml:space="preserve">Secondary Keywords:</w:t>
+      </w:r>
+      <w:r>
+        <w:rPr/>
+        <w:t xml:space="preserve"> hardest water states, water hardness by state, is my water hard, grains per gallon hardness </w:t>
+      </w:r>
+      <w:r>
+        <w:rPr>
+          <w:b/>
+        </w:rPr>
+        <w:t xml:space="preserve">LSI / Semantic Keywords:</w:t>
+      </w:r>
+      <w:r>
+        <w:rPr/>
+        <w:t xml:space="preserve"> calcium carbonate, grains per gallon, mg/L hardness, limestone aquifers, soft vs hard water, USGS hardness data </w:t>
+      </w:r>
+      <w:r>
+        <w:rPr>
+          <w:b/>
+        </w:rPr>
+        <w:t xml:space="preserve">Image Alt Text:</w:t>
+      </w:r>
+      <w:r>
+        <w:rPr/>
+        <w:t xml:space="preserve"> Color-graded map of the United States showing water hardness by state from soft to very hard with a grains-per-gallon legend</w:t>
       </w:r>
     </w:p>
     <w:p>
@@ -4485,9 +4941,85 @@
     <w:p>
       <w:r>
         <w:rPr>
-          <w:i/>
-        </w:rPr>
-        <w:t xml:space="preserve">Focus keyword: cost of hard water on home • Meta description: Hard water quietly drains thousands from your wallet — water heaters, dishwashers, detergent, and plumbing. Here's the 10-year math and the ROI of softening.</w:t>
+          <w:b/>
+        </w:rPr>
+        <w:t xml:space="preserve">SEO Title:</w:t>
+      </w:r>
+      <w:r>
+        <w:rPr/>
+        <w:t xml:space="preserve"> The True 10-Year Cost of Hard Water on Your Home </w:t>
+      </w:r>
+      <w:r>
+        <w:rPr>
+          <w:b/>
+        </w:rPr>
+        <w:t xml:space="preserve">URL Slug:</w:t>
+      </w:r>
+      <w:r>
+        <w:rPr/>
+        <w:t xml:space="preserve"> </w:t>
+      </w:r>
+      <w:r>
+        <w:rPr>
+          <w:rFonts w:ascii="Consolas" w:hAnsi="Consolas"/>
+          <w:sz w:val="20"/>
+          <w:shd w:val="clear" w:color="auto" w:fill="F2F2F2"/>
+        </w:rPr>
+        <w:t xml:space="preserve">/true-cost-of-hard-water-on-your-home</w:t>
+      </w:r>
+      <w:r>
+        <w:rPr/>
+        <w:t xml:space="preserve"> </w:t>
+      </w:r>
+      <w:r>
+        <w:rPr>
+          <w:b/>
+        </w:rPr>
+        <w:t xml:space="preserve">Meta Description:</w:t>
+      </w:r>
+      <w:r>
+        <w:rPr/>
+        <w:t xml:space="preserve"> Hard water quietly drains thousands from your wallet — water heaters, appliances, detergent, and plumbing. Here's the 10-year math and the ROI of softening. </w:t>
+      </w:r>
+      <w:r>
+        <w:rPr>
+          <w:b/>
+        </w:rPr>
+        <w:t xml:space="preserve">Focus Keyword:</w:t>
+      </w:r>
+      <w:r>
+        <w:rPr/>
+        <w:t xml:space="preserve"> cost of hard water on home </w:t>
+      </w:r>
+      <w:r>
+        <w:rPr>
+          <w:b/>
+        </w:rPr>
+        <w:t xml:space="preserve">Secondary Keywords:</w:t>
+      </w:r>
+      <w:r>
+        <w:rPr/>
+        <w:t xml:space="preserve"> hard water appliance damage, does hard water increase energy bills, hard water plumbing repair, water softener ROI </w:t>
+      </w:r>
+      <w:r>
+        <w:rPr>
+          <w:b/>
+        </w:rPr>
+        <w:t xml:space="preserve">LSI / Semantic Keywords:</w:t>
+      </w:r>
+      <w:r>
+        <w:rPr/>
+        <w:t xml:space="preserve"> scale buildup water heater efficiency, limescale, appliance lifespan, payback period, detergent overuse </w:t>
+      </w:r>
+      <w:r>
+        <w:rPr>
+          <w:b/>
+        </w:rPr>
+        <w:t xml:space="preserve">Image Alt Text:</w:t>
+      </w:r>
+      <w:r>
+        <w:rPr/>
+        <w:t xml:space="preserve"> Cutaway of a home showing where hard water costs money over 10 years at the water heater, dishwasher, washer, and pipes</w:t>
       </w:r>
     </w:p>
     <w:p>
@@ -5001,9 +5533,85 @@
     <w:p>
       <w:r>
         <w:rPr>
-          <w:i/>
-        </w:rPr>
-        <w:t xml:space="preserve">Focus keyword: limescale buildup • Meta description: Limescale is the chalky residue from hard water — and it's killing your water heater, dishwasher, and pipes. Learn how it forms, how to remove it, and how to prevent it.</w:t>
+          <w:b/>
+        </w:rPr>
+        <w:t xml:space="preserve">SEO Title:</w:t>
+      </w:r>
+      <w:r>
+        <w:rPr/>
+        <w:t xml:space="preserve"> Limescale: How Hard Water Scale Destroys Appliances </w:t>
+      </w:r>
+      <w:r>
+        <w:rPr>
+          <w:b/>
+        </w:rPr>
+        <w:t xml:space="preserve">URL Slug:</w:t>
+      </w:r>
+      <w:r>
+        <w:rPr/>
+        <w:t xml:space="preserve"> </w:t>
+      </w:r>
+      <w:r>
+        <w:rPr>
+          <w:rFonts w:ascii="Consolas" w:hAnsi="Consolas"/>
+          <w:sz w:val="20"/>
+          <w:shd w:val="clear" w:color="auto" w:fill="F2F2F2"/>
+        </w:rPr>
+        <w:t xml:space="preserve">/limescale-damage-appliances-pipes-guide</w:t>
+      </w:r>
+      <w:r>
+        <w:rPr/>
+        <w:t xml:space="preserve"> </w:t>
+      </w:r>
+      <w:r>
+        <w:rPr>
+          <w:b/>
+        </w:rPr>
+        <w:t xml:space="preserve">Meta Description:</w:t>
+      </w:r>
+      <w:r>
+        <w:rPr/>
+        <w:t xml:space="preserve"> Limescale is the chalky residue from hard water — and it's killing your water heater, dishwasher, and pipes. How it forms, how to remove it, how to prevent it. </w:t>
+      </w:r>
+      <w:r>
+        <w:rPr>
+          <w:b/>
+        </w:rPr>
+        <w:t xml:space="preserve">Focus Keyword:</w:t>
+      </w:r>
+      <w:r>
+        <w:rPr/>
+        <w:t xml:space="preserve"> limescale buildup </w:t>
+      </w:r>
+      <w:r>
+        <w:rPr>
+          <w:b/>
+        </w:rPr>
+        <w:t xml:space="preserve">Secondary Keywords:</w:t>
+      </w:r>
+      <w:r>
+        <w:rPr/>
+        <w:t xml:space="preserve"> how to remove limescale, scale in water heater, limescale in pipes, hard water scale appliances </w:t>
+      </w:r>
+      <w:r>
+        <w:rPr>
+          <w:b/>
+        </w:rPr>
+        <w:t xml:space="preserve">LSI / Semantic Keywords:</w:t>
+      </w:r>
+      <w:r>
+        <w:rPr/>
+        <w:t xml:space="preserve"> calcium carbonate deposits, descaling, heating element efficiency, scale prevention, mineral buildup faucets </w:t>
+      </w:r>
+      <w:r>
+        <w:rPr>
+          <w:b/>
+        </w:rPr>
+        <w:t xml:space="preserve">Image Alt Text:</w:t>
+      </w:r>
+      <w:r>
+        <w:rPr/>
+        <w:t xml:space="preserve"> Cross-section comparing a limescale-coated water heater element with a clean one and the efficiency loss it causes</w:t>
       </w:r>
     </w:p>
     <w:p>
@@ -5528,9 +6136,85 @@
     <w:p>
       <w:r>
         <w:rPr>
-          <w:i/>
-        </w:rPr>
-        <w:t xml:space="preserve">Focus keyword: do salt-free water softeners work • Meta description: "Salt-free softener" is a misnomer — but the technology is real. Here's how template-assisted crystallization works, what it does (and doesn't) do, and when to choose it.</w:t>
+          <w:b/>
+        </w:rPr>
+        <w:t xml:space="preserve">SEO Title:</w:t>
+      </w:r>
+      <w:r>
+        <w:rPr/>
+        <w:t xml:space="preserve"> Do Salt-Free Water Softeners Work? The TAC Science </w:t>
+      </w:r>
+      <w:r>
+        <w:rPr>
+          <w:b/>
+        </w:rPr>
+        <w:t xml:space="preserve">URL Slug:</w:t>
+      </w:r>
+      <w:r>
+        <w:rPr/>
+        <w:t xml:space="preserve"> </w:t>
+      </w:r>
+      <w:r>
+        <w:rPr>
+          <w:rFonts w:ascii="Consolas" w:hAnsi="Consolas"/>
+          <w:sz w:val="20"/>
+          <w:shd w:val="clear" w:color="auto" w:fill="F2F2F2"/>
+        </w:rPr>
+        <w:t xml:space="preserve">/do-salt-free-water-conditioners-work-tac-science</w:t>
+      </w:r>
+      <w:r>
+        <w:rPr/>
+        <w:t xml:space="preserve"> </w:t>
+      </w:r>
+      <w:r>
+        <w:rPr>
+          <w:b/>
+        </w:rPr>
+        <w:t xml:space="preserve">Meta Description:</w:t>
+      </w:r>
+      <w:r>
+        <w:rPr/>
+        <w:t xml:space="preserve"> "Salt-free softener" is a misnomer — but the technology is real. How template-assisted crystallization works, what it does and doesn't do, and when to choose it. </w:t>
+      </w:r>
+      <w:r>
+        <w:rPr>
+          <w:b/>
+        </w:rPr>
+        <w:t xml:space="preserve">Focus Keyword:</w:t>
+      </w:r>
+      <w:r>
+        <w:rPr/>
+        <w:t xml:space="preserve"> do salt-free water softeners work </w:t>
+      </w:r>
+      <w:r>
+        <w:rPr>
+          <w:b/>
+        </w:rPr>
+        <w:t xml:space="preserve">Secondary Keywords:</w:t>
+      </w:r>
+      <w:r>
+        <w:rPr/>
+        <w:t xml:space="preserve"> salt-free water conditioner, template assisted crystallization, salt-free vs salt-based softener, no-salt water softener </w:t>
+      </w:r>
+      <w:r>
+        <w:rPr>
+          <w:b/>
+        </w:rPr>
+        <w:t xml:space="preserve">LSI / Semantic Keywords:</w:t>
+      </w:r>
+      <w:r>
+        <w:rPr/>
+        <w:t xml:space="preserve"> TAC media, nucleation, scale prevention vs removal, ion exchange, sodium in softened water, maintenance-free conditioning </w:t>
+      </w:r>
+      <w:r>
+        <w:rPr>
+          <w:b/>
+        </w:rPr>
+        <w:t xml:space="preserve">Image Alt Text:</w:t>
+      </w:r>
+      <w:r>
+        <w:rPr/>
+        <w:t xml:space="preserve"> Side-by-side diagram of salt-based ion exchange versus salt-free template-assisted crystallization water treatment</w:t>
       </w:r>
     </w:p>
     <w:p>
@@ -6368,9 +7052,85 @@
     <w:p>
       <w:r>
         <w:rPr>
-          <w:i/>
-        </w:rPr>
-        <w:t xml:space="preserve">Focus keyword: hard water and skin • Meta description: Dry skin, dull hair, itchy scalp, eczema flare-ups — hard water may be the culprit. Here's the science and the at-the-source fix that actually works.</w:t>
+          <w:b/>
+        </w:rPr>
+        <w:t xml:space="preserve">SEO Title:</w:t>
+      </w:r>
+      <w:r>
+        <w:rPr/>
+        <w:t xml:space="preserve"> Hard Water, Skin &amp; Hair: Is Your Water the Culprit? </w:t>
+      </w:r>
+      <w:r>
+        <w:rPr>
+          <w:b/>
+        </w:rPr>
+        <w:t xml:space="preserve">URL Slug:</w:t>
+      </w:r>
+      <w:r>
+        <w:rPr/>
+        <w:t xml:space="preserve"> </w:t>
+      </w:r>
+      <w:r>
+        <w:rPr>
+          <w:rFonts w:ascii="Consolas" w:hAnsi="Consolas"/>
+          <w:sz w:val="20"/>
+          <w:shd w:val="clear" w:color="auto" w:fill="F2F2F2"/>
+        </w:rPr>
+        <w:t xml:space="preserve">/hard-water-skin-hair-guide</w:t>
+      </w:r>
+      <w:r>
+        <w:rPr/>
+        <w:t xml:space="preserve"> </w:t>
+      </w:r>
+      <w:r>
+        <w:rPr>
+          <w:b/>
+        </w:rPr>
+        <w:t xml:space="preserve">Meta Description:</w:t>
+      </w:r>
+      <w:r>
+        <w:rPr/>
+        <w:t xml:space="preserve"> Dry skin, dull hair, itchy scalp, eczema flare-ups — hard water may be the culprit. Here's the science and the at-the-source fix that actually works. </w:t>
+      </w:r>
+      <w:r>
+        <w:rPr>
+          <w:b/>
+        </w:rPr>
+        <w:t xml:space="preserve">Focus Keyword:</w:t>
+      </w:r>
+      <w:r>
+        <w:rPr/>
+        <w:t xml:space="preserve"> hard water and skin </w:t>
+      </w:r>
+      <w:r>
+        <w:rPr>
+          <w:b/>
+        </w:rPr>
+        <w:t xml:space="preserve">Secondary Keywords:</w:t>
+      </w:r>
+      <w:r>
+        <w:rPr/>
+        <w:t xml:space="preserve"> hard water hair damage, hard water eczema, does hard water cause dry skin, water softener for skin </w:t>
+      </w:r>
+      <w:r>
+        <w:rPr>
+          <w:b/>
+        </w:rPr>
+        <w:t xml:space="preserve">LSI / Semantic Keywords:</w:t>
+      </w:r>
+      <w:r>
+        <w:rPr/>
+        <w:t xml:space="preserve"> soap scum on skin, mineral residue, skin barrier, eczema flare triggers, hair dullness, scalp buildup </w:t>
+      </w:r>
+      <w:r>
+        <w:rPr>
+          <w:b/>
+        </w:rPr>
+        <w:t xml:space="preserve">Image Alt Text:</w:t>
+      </w:r>
+      <w:r>
+        <w:rPr/>
+        <w:t xml:space="preserve"> Before-and-after comparison of skin and hair washed in hard water versus softened water</w:t>
       </w:r>
     </w:p>
     <w:p>
@@ -6788,9 +7548,85 @@
     <w:p>
       <w:r>
         <w:rPr>
-          <w:i/>
-        </w:rPr>
-        <w:t xml:space="preserve">Focus keyword: whole house water filtration system cost • Meta description: What does a whole-house water filtration system really cost in 2026? Upfront price, installation, lifetime filter costs, financing, and true ROI — explained with no sales fluff.</w:t>
+          <w:b/>
+        </w:rPr>
+        <w:t xml:space="preserve">SEO Title:</w:t>
+      </w:r>
+      <w:r>
+        <w:rPr/>
+        <w:t xml:space="preserve"> Whole-House Water Filtration System Cost (2026) </w:t>
+      </w:r>
+      <w:r>
+        <w:rPr>
+          <w:b/>
+        </w:rPr>
+        <w:t xml:space="preserve">URL Slug:</w:t>
+      </w:r>
+      <w:r>
+        <w:rPr/>
+        <w:t xml:space="preserve"> </w:t>
+      </w:r>
+      <w:r>
+        <w:rPr>
+          <w:rFonts w:ascii="Consolas" w:hAnsi="Consolas"/>
+          <w:sz w:val="20"/>
+          <w:shd w:val="clear" w:color="auto" w:fill="F2F2F2"/>
+        </w:rPr>
+        <w:t xml:space="preserve">/whole-house-water-filtration-system-cost</w:t>
+      </w:r>
+      <w:r>
+        <w:rPr/>
+        <w:t xml:space="preserve"> </w:t>
+      </w:r>
+      <w:r>
+        <w:rPr>
+          <w:b/>
+        </w:rPr>
+        <w:t xml:space="preserve">Meta Description:</w:t>
+      </w:r>
+      <w:r>
+        <w:rPr/>
+        <w:t xml:space="preserve"> What does a whole-house water filtration system really cost? Upfront price, installation, lifetime filter costs, financing, and true ROI — no sales fluff. </w:t>
+      </w:r>
+      <w:r>
+        <w:rPr>
+          <w:b/>
+        </w:rPr>
+        <w:t xml:space="preserve">Focus Keyword:</w:t>
+      </w:r>
+      <w:r>
+        <w:rPr/>
+        <w:t xml:space="preserve"> whole house water filtration system cost </w:t>
+      </w:r>
+      <w:r>
+        <w:rPr>
+          <w:b/>
+        </w:rPr>
+        <w:t xml:space="preserve">Secondary Keywords:</w:t>
+      </w:r>
+      <w:r>
+        <w:rPr/>
+        <w:t xml:space="preserve"> how much does a water filtration system cost, water filtration system price, water softener installation cost </w:t>
+      </w:r>
+      <w:r>
+        <w:rPr>
+          <w:b/>
+        </w:rPr>
+        <w:t xml:space="preserve">LSI / Semantic Keywords:</w:t>
+      </w:r>
+      <w:r>
+        <w:rPr/>
+        <w:t xml:space="preserve"> total cost of ownership, installation labor, filter replacement cost, financing, return on investment, lifetime warranty value </w:t>
+      </w:r>
+      <w:r>
+        <w:rPr>
+          <w:b/>
+        </w:rPr>
+        <w:t xml:space="preserve">Image Alt Text:</w:t>
+      </w:r>
+      <w:r>
+        <w:rPr/>
+        <w:t xml:space="preserve"> 10-year total cost of ownership chart comparing a pitcher filter, point-of-use filter, and whole-house system</w:t>
       </w:r>
     </w:p>
     <w:p>
@@ -7642,9 +8478,85 @@
     <w:p>
       <w:r>
         <w:rPr>
-          <w:i/>
-        </w:rPr>
-        <w:t xml:space="preserve">Focus keyword: reverse osmosis vs whole house filtration • Meta description: RO and whole-house filtration solve different problems. Learn the difference between point-of-use and point-of-entry — and why many homes benefit from both.</w:t>
+          <w:b/>
+        </w:rPr>
+        <w:t xml:space="preserve">SEO Title:</w:t>
+      </w:r>
+      <w:r>
+        <w:rPr/>
+        <w:t xml:space="preserve"> Reverse Osmosis vs. Whole-House Filtration </w:t>
+      </w:r>
+      <w:r>
+        <w:rPr>
+          <w:b/>
+        </w:rPr>
+        <w:t xml:space="preserve">URL Slug:</w:t>
+      </w:r>
+      <w:r>
+        <w:rPr/>
+        <w:t xml:space="preserve"> </w:t>
+      </w:r>
+      <w:r>
+        <w:rPr>
+          <w:rFonts w:ascii="Consolas" w:hAnsi="Consolas"/>
+          <w:sz w:val="20"/>
+          <w:shd w:val="clear" w:color="auto" w:fill="F2F2F2"/>
+        </w:rPr>
+        <w:t xml:space="preserve">/reverse-osmosis-vs-whole-house-filtration</w:t>
+      </w:r>
+      <w:r>
+        <w:rPr/>
+        <w:t xml:space="preserve"> </w:t>
+      </w:r>
+      <w:r>
+        <w:rPr>
+          <w:b/>
+        </w:rPr>
+        <w:t xml:space="preserve">Meta Description:</w:t>
+      </w:r>
+      <w:r>
+        <w:rPr/>
+        <w:t xml:space="preserve"> RO and whole-house filtration solve different problems. Learn point-of-use vs. point-of-entry — and why many U.S. homes benefit from both. </w:t>
+      </w:r>
+      <w:r>
+        <w:rPr>
+          <w:b/>
+        </w:rPr>
+        <w:t xml:space="preserve">Focus Keyword:</w:t>
+      </w:r>
+      <w:r>
+        <w:rPr/>
+        <w:t xml:space="preserve"> reverse osmosis vs whole house filtration </w:t>
+      </w:r>
+      <w:r>
+        <w:rPr>
+          <w:b/>
+        </w:rPr>
+        <w:t xml:space="preserve">Secondary Keywords:</w:t>
+      </w:r>
+      <w:r>
+        <w:rPr/>
+        <w:t xml:space="preserve"> point of use vs point of entry, do I need RO and whole house filter, RO vs whole house water filter </w:t>
+      </w:r>
+      <w:r>
+        <w:rPr>
+          <w:b/>
+        </w:rPr>
+        <w:t xml:space="preserve">LSI / Semantic Keywords:</w:t>
+      </w:r>
+      <w:r>
+        <w:rPr/>
+        <w:t xml:space="preserve"> point-of-entry POE, point-of-use POU, TDS reduction, remineralization, layered filtration, drinking vs shower water </w:t>
+      </w:r>
+      <w:r>
+        <w:rPr>
+          <w:b/>
+        </w:rPr>
+        <w:t xml:space="preserve">Image Alt Text:</w:t>
+      </w:r>
+      <w:r>
+        <w:rPr/>
+        <w:t xml:space="preserve"> Cutaway home diagram showing where whole-house filtration and under-sink reverse osmosis each install and protect</w:t>
       </w:r>
     </w:p>
     <w:p>
@@ -8429,9 +9341,85 @@
     <w:p>
       <w:r>
         <w:rPr>
-          <w:i/>
-        </w:rPr>
-        <w:t xml:space="preserve">Focus keyword: how to choose a water filtration company • Meta description: Not all water companies are equal. Use these 12 questions to spot high-pressure sales, hidden costs, and weak warranties — and find a company you can trust for life.</w:t>
+          <w:b/>
+        </w:rPr>
+        <w:t xml:space="preserve">SEO Title:</w:t>
+      </w:r>
+      <w:r>
+        <w:rPr/>
+        <w:t xml:space="preserve"> How to Choose a Water Filtration Company: 12 Questions </w:t>
+      </w:r>
+      <w:r>
+        <w:rPr>
+          <w:b/>
+        </w:rPr>
+        <w:t xml:space="preserve">URL Slug:</w:t>
+      </w:r>
+      <w:r>
+        <w:rPr/>
+        <w:t xml:space="preserve"> </w:t>
+      </w:r>
+      <w:r>
+        <w:rPr>
+          <w:rFonts w:ascii="Consolas" w:hAnsi="Consolas"/>
+          <w:sz w:val="20"/>
+          <w:shd w:val="clear" w:color="auto" w:fill="F2F2F2"/>
+        </w:rPr>
+        <w:t xml:space="preserve">/how-to-choose-a-water-filtration-company</w:t>
+      </w:r>
+      <w:r>
+        <w:rPr/>
+        <w:t xml:space="preserve"> </w:t>
+      </w:r>
+      <w:r>
+        <w:rPr>
+          <w:b/>
+        </w:rPr>
+        <w:t xml:space="preserve">Meta Description:</w:t>
+      </w:r>
+      <w:r>
+        <w:rPr/>
+        <w:t xml:space="preserve"> Not all water companies are equal. Use these 12 questions to spot high-pressure sales, hidden costs, and weak warranties — and find one you can trust. </w:t>
+      </w:r>
+      <w:r>
+        <w:rPr>
+          <w:b/>
+        </w:rPr>
+        <w:t xml:space="preserve">Focus Keyword:</w:t>
+      </w:r>
+      <w:r>
+        <w:rPr/>
+        <w:t xml:space="preserve"> how to choose a water filtration company </w:t>
+      </w:r>
+      <w:r>
+        <w:rPr>
+          <w:b/>
+        </w:rPr>
+        <w:t xml:space="preserve">Secondary Keywords:</w:t>
+      </w:r>
+      <w:r>
+        <w:rPr/>
+        <w:t xml:space="preserve"> best water filtration company, water treatment company near me, water softener company questions, avoid water filter scams </w:t>
+      </w:r>
+      <w:r>
+        <w:rPr>
+          <w:b/>
+        </w:rPr>
+        <w:t xml:space="preserve">LSI / Semantic Keywords:</w:t>
+      </w:r>
+      <w:r>
+        <w:rPr/>
+        <w:t xml:space="preserve"> NSF certification, warranty terms, free water test, high-pressure sales, installation guarantee, certified water specialist </w:t>
+      </w:r>
+      <w:r>
+        <w:rPr>
+          <w:b/>
+        </w:rPr>
+        <w:t xml:space="preserve">Image Alt Text:</w:t>
+      </w:r>
+      <w:r>
+        <w:rPr/>
+        <w:t xml:space="preserve"> Green-flags-versus-red-flags checklist for choosing a trustworthy water filtration company</w:t>
       </w:r>
     </w:p>
     <w:p>
@@ -9066,9 +10054,85 @@
     <w:p>
       <w:r>
         <w:rPr>
-          <w:i/>
-        </w:rPr>
-        <w:t xml:space="preserve">Focus keyword: tankless reverse osmosis system • Meta description: Tankless RO delivers purer, fresher drinking water with less waste and no bulky tank. Here's how it works, what to look for, and whether it's right for your kitchen.</w:t>
+          <w:b/>
+        </w:rPr>
+        <w:t xml:space="preserve">SEO Title:</w:t>
+      </w:r>
+      <w:r>
+        <w:rPr/>
+        <w:t xml:space="preserve"> Tankless Reverse Osmosis Systems: Buyer's Guide </w:t>
+      </w:r>
+      <w:r>
+        <w:rPr>
+          <w:b/>
+        </w:rPr>
+        <w:t xml:space="preserve">URL Slug:</w:t>
+      </w:r>
+      <w:r>
+        <w:rPr/>
+        <w:t xml:space="preserve"> </w:t>
+      </w:r>
+      <w:r>
+        <w:rPr>
+          <w:rFonts w:ascii="Consolas" w:hAnsi="Consolas"/>
+          <w:sz w:val="20"/>
+          <w:shd w:val="clear" w:color="auto" w:fill="F2F2F2"/>
+        </w:rPr>
+        <w:t xml:space="preserve">/tankless-reverse-osmosis-drinking-water-buyers-guide</w:t>
+      </w:r>
+      <w:r>
+        <w:rPr/>
+        <w:t xml:space="preserve"> </w:t>
+      </w:r>
+      <w:r>
+        <w:rPr>
+          <w:b/>
+        </w:rPr>
+        <w:t xml:space="preserve">Meta Description:</w:t>
+      </w:r>
+      <w:r>
+        <w:rPr/>
+        <w:t xml:space="preserve"> Tankless RO delivers purer, fresher drinking water with less waste and no bulky tank. How it works, what to look for, and whether it's right for your kitchen. </w:t>
+      </w:r>
+      <w:r>
+        <w:rPr>
+          <w:b/>
+        </w:rPr>
+        <w:t xml:space="preserve">Focus Keyword:</w:t>
+      </w:r>
+      <w:r>
+        <w:rPr/>
+        <w:t xml:space="preserve"> tankless reverse osmosis system </w:t>
+      </w:r>
+      <w:r>
+        <w:rPr>
+          <w:b/>
+        </w:rPr>
+        <w:t xml:space="preserve">Secondary Keywords:</w:t>
+      </w:r>
+      <w:r>
+        <w:rPr/>
+        <w:t xml:space="preserve"> best reverse osmosis system, RO drinking water system, instant hot water RO, under sink reverse osmosis </w:t>
+      </w:r>
+      <w:r>
+        <w:rPr>
+          <w:b/>
+        </w:rPr>
+        <w:t xml:space="preserve">LSI / Semantic Keywords:</w:t>
+      </w:r>
+      <w:r>
+        <w:rPr/>
+        <w:t xml:space="preserve"> tank vs tankless RO, wastewater ratio, remineralization stage, flow rate, digital faucet, TDS meter, InstaHot </w:t>
+      </w:r>
+      <w:r>
+        <w:rPr>
+          <w:b/>
+        </w:rPr>
+        <w:t xml:space="preserve">Image Alt Text:</w:t>
+      </w:r>
+      <w:r>
+        <w:rPr/>
+        <w:t xml:space="preserve"> Labeled diagram of a tankless reverse osmosis system showing each filtration stage and the digital InstaHot faucet</w:t>
       </w:r>
     </w:p>
     <w:p>
@@ -9575,9 +10639,85 @@
     <w:p>
       <w:r>
         <w:rPr>
-          <w:i/>
-        </w:rPr>
-        <w:t xml:space="preserve">Focus keyword: city water vs well water filtration • Meta description: City water and well water have completely different problems — and need different solutions. Here's how to filter each correctly for safe, great-tasting water.</w:t>
+          <w:b/>
+        </w:rPr>
+        <w:t xml:space="preserve">SEO Title:</w:t>
+      </w:r>
+      <w:r>
+        <w:rPr/>
+        <w:t xml:space="preserve"> City Water vs. Well Water: Filtration Compared </w:t>
+      </w:r>
+      <w:r>
+        <w:rPr>
+          <w:b/>
+        </w:rPr>
+        <w:t xml:space="preserve">URL Slug:</w:t>
+      </w:r>
+      <w:r>
+        <w:rPr/>
+        <w:t xml:space="preserve"> </w:t>
+      </w:r>
+      <w:r>
+        <w:rPr>
+          <w:rFonts w:ascii="Consolas" w:hAnsi="Consolas"/>
+          <w:sz w:val="20"/>
+          <w:shd w:val="clear" w:color="auto" w:fill="F2F2F2"/>
+        </w:rPr>
+        <w:t xml:space="preserve">/city-water-vs-well-water-filtration</w:t>
+      </w:r>
+      <w:r>
+        <w:rPr/>
+        <w:t xml:space="preserve"> </w:t>
+      </w:r>
+      <w:r>
+        <w:rPr>
+          <w:b/>
+        </w:rPr>
+        <w:t xml:space="preserve">Meta Description:</w:t>
+      </w:r>
+      <w:r>
+        <w:rPr/>
+        <w:t xml:space="preserve"> City water and well water have completely different problems — and need different solutions. Here's how to filter each for safe, great-tasting water. </w:t>
+      </w:r>
+      <w:r>
+        <w:rPr>
+          <w:b/>
+        </w:rPr>
+        <w:t xml:space="preserve">Focus Keyword:</w:t>
+      </w:r>
+      <w:r>
+        <w:rPr/>
+        <w:t xml:space="preserve"> city water vs well water filtration </w:t>
+      </w:r>
+      <w:r>
+        <w:rPr>
+          <w:b/>
+        </w:rPr>
+        <w:t xml:space="preserve">Secondary Keywords:</w:t>
+      </w:r>
+      <w:r>
+        <w:rPr/>
+        <w:t xml:space="preserve"> municipal vs well water treatment, do I need a different filter for well water, treating well water at home </w:t>
+      </w:r>
+      <w:r>
+        <w:rPr>
+          <w:b/>
+        </w:rPr>
+        <w:t xml:space="preserve">LSI / Semantic Keywords:</w:t>
+      </w:r>
+      <w:r>
+        <w:rPr/>
+        <w:t xml:space="preserve"> chlorine and chloramine, disinfection byproducts, bacteria and sediment, iron and sulfur, treatment train design </w:t>
+      </w:r>
+      <w:r>
+        <w:rPr>
+          <w:b/>
+        </w:rPr>
+        <w:t xml:space="preserve">Image Alt Text:</w:t>
+      </w:r>
+      <w:r>
+        <w:rPr/>
+        <w:t xml:space="preserve"> Two side-by-side water treatment trains showing recommended filtration stages for city water versus well water</w:t>
       </w:r>
     </w:p>
     <w:p>
@@ -10445,9 +11585,95 @@
     <w:p>
       <w:r>
         <w:rPr>
-          <w:i/>
-        </w:rPr>
-        <w:t xml:space="preserve">Focus keyword: does water quality affect health • Meta description: Hydration is only half the story. The quality of your water affects energy, skin, and long-term health. Here's the science — framed for U.S. families.</w:t>
+          <w:b/>
+        </w:rPr>
+        <w:t xml:space="preserve">SEO Title:</w:t>
+      </w:r>
+      <w:r>
+        <w:rPr/>
+        <w:t xml:space="preserve"> How Water Quality Affects Your Health (Not Just Hydration) </w:t>
+      </w:r>
+      <w:r>
+        <w:rPr>
+          <w:b/>
+        </w:rPr>
+        <w:t xml:space="preserve">URL Slug:</w:t>
+      </w:r>
+      <w:r>
+        <w:rPr/>
+        <w:t xml:space="preserve"> </w:t>
+      </w:r>
+      <w:r>
+        <w:rPr>
+          <w:rFonts w:ascii="Consolas" w:hAnsi="Consolas"/>
+          <w:sz w:val="20"/>
+          <w:shd w:val="clear" w:color="auto" w:fill="F2F2F2"/>
+        </w:rPr>
+        <w:t xml:space="preserve">/water-quality-and-health-energy-skin-hydration</w:t>
+      </w:r>
+      <w:r>
+        <w:rPr/>
+        <w:t xml:space="preserve"> </w:t>
+      </w:r>
+      <w:r>
+        <w:rPr>
+          <w:b/>
+        </w:rPr>
+        <w:t xml:space="preserve">Meta Description:</w:t>
+      </w:r>
+      <w:r>
+        <w:rPr/>
+        <w:t xml:space="preserve"> Hydration is only half the story. The quality of your water affects energy, skin, and long-term health. Here's the science for U.S. families. </w:t>
+      </w:r>
+      <w:r>
+        <w:rPr>
+          <w:b/>
+        </w:rPr>
+        <w:t xml:space="preserve">Focus Keyword:</w:t>
+      </w:r>
+      <w:r>
+        <w:rPr/>
+        <w:t xml:space="preserve"> does water quality affect health </w:t>
+      </w:r>
+      <w:r>
+        <w:rPr>
+          <w:b/>
+        </w:rPr>
+        <w:t xml:space="preserve">Secondary Keywords:</w:t>
+      </w:r>
+      <w:r>
+        <w:rPr/>
+        <w:t xml:space="preserve"> benefits of filtered water, clean water and energy, hydration and skin health, is filtered water healthier </w:t>
+      </w:r>
+      <w:r>
+        <w:rPr>
+          <w:b/>
+        </w:rPr>
+        <w:t xml:space="preserve">LSI / Semantic Keywords:</w:t>
+      </w:r>
+      <w:r>
+        <w:rPr/>
+        <w:t xml:space="preserve"> cellular hydration, contaminant body burden, chlorine byproducts, skin barrier, long-term exposure, cumulative exposure </w:t>
+      </w:r>
+      <w:r>
+        <w:rPr>
+          <w:b/>
+        </w:rPr>
+        <w:t xml:space="preserve">Image Alt Text:</w:t>
+      </w:r>
+      <w:r>
+        <w:rPr/>
+        <w:t xml:space="preserve"> Illustration of a glass of clean water and the body systems that benefit from better water quality</w:t>
+      </w:r>
+      <w:r>
+        <w:rPr>
+          <w:b/>
+        </w:rPr>
+        <w:t xml:space="preserve">Medically reviewed by:</w:t>
+      </w:r>
+      <w:r>
+        <w:rPr/>
+        <w:t xml:space="preserve"> Dr. Ronald Sidney Stuart, M.D. (add review date on publish)</w:t>
       </w:r>
     </w:p>
     <w:p>
@@ -10760,9 +11986,95 @@
     <w:p>
       <w:r>
         <w:rPr>
-          <w:i/>
-        </w:rPr>
-        <w:t xml:space="preserve">Focus keyword: safe water for babies • Meta description: What water is safe for baby formula and pregnancy? We cover nitrates, lead, fluoride, and filtration — a calm, clear guide for U.S. parents.</w:t>
+          <w:b/>
+        </w:rPr>
+        <w:t xml:space="preserve">SEO Title:</w:t>
+      </w:r>
+      <w:r>
+        <w:rPr/>
+        <w:t xml:space="preserve"> Safe Water for Babies &amp; Pregnancy: Parent's Guide </w:t>
+      </w:r>
+      <w:r>
+        <w:rPr>
+          <w:b/>
+        </w:rPr>
+        <w:t xml:space="preserve">URL Slug:</w:t>
+      </w:r>
+      <w:r>
+        <w:rPr/>
+        <w:t xml:space="preserve"> </w:t>
+      </w:r>
+      <w:r>
+        <w:rPr>
+          <w:rFonts w:ascii="Consolas" w:hAnsi="Consolas"/>
+          <w:sz w:val="20"/>
+          <w:shd w:val="clear" w:color="auto" w:fill="F2F2F2"/>
+        </w:rPr>
+        <w:t xml:space="preserve">/safe-water-for-babies-pregnancy-formula-guide</w:t>
+      </w:r>
+      <w:r>
+        <w:rPr/>
+        <w:t xml:space="preserve"> </w:t>
+      </w:r>
+      <w:r>
+        <w:rPr>
+          <w:b/>
+        </w:rPr>
+        <w:t xml:space="preserve">Meta Description:</w:t>
+      </w:r>
+      <w:r>
+        <w:rPr/>
+        <w:t xml:space="preserve"> What water is safe for baby formula and pregnancy? We cover nitrates, lead, fluoride, and filtration — a calm, clear guide for U.S. parents. </w:t>
+      </w:r>
+      <w:r>
+        <w:rPr>
+          <w:b/>
+        </w:rPr>
+        <w:t xml:space="preserve">Focus Keyword:</w:t>
+      </w:r>
+      <w:r>
+        <w:rPr/>
+        <w:t xml:space="preserve"> safe water for babies </w:t>
+      </w:r>
+      <w:r>
+        <w:rPr>
+          <w:b/>
+        </w:rPr>
+        <w:t xml:space="preserve">Secondary Keywords:</w:t>
+      </w:r>
+      <w:r>
+        <w:rPr/>
+        <w:t xml:space="preserve"> is tap water safe for formula, water for baby formula, fluoride and babies, pregnancy and tap water </w:t>
+      </w:r>
+      <w:r>
+        <w:rPr>
+          <w:b/>
+        </w:rPr>
+        <w:t xml:space="preserve">LSI / Semantic Keywords:</w:t>
+      </w:r>
+      <w:r>
+        <w:rPr/>
+        <w:t xml:space="preserve"> nitrates and infants, methemoglobinemia, lead and child development, boiled vs filtered water, reverse osmosis formula </w:t>
+      </w:r>
+      <w:r>
+        <w:rPr>
+          <w:b/>
+        </w:rPr>
+        <w:t xml:space="preserve">Image Alt Text:</w:t>
+      </w:r>
+      <w:r>
+        <w:rPr/>
+        <w:t xml:space="preserve"> Parent-friendly checklist of baby-safe water steps for mixing infant formula </w:t>
+      </w:r>
+      <w:r>
+        <w:rPr>
+          <w:b/>
+        </w:rPr>
+        <w:t xml:space="preserve">Medically reviewed by:</w:t>
+      </w:r>
+      <w:r>
+        <w:rPr/>
+        <w:t xml:space="preserve"> Dr. Ronald Sidney Stuart, M.D. (add review date on publish)</w:t>
       </w:r>
     </w:p>
     <w:p>
@@ -11133,9 +12445,85 @@
     <w:p>
       <w:r>
         <w:rPr>
-          <w:i/>
-        </w:rPr>
-        <w:t xml:space="preserve">Focus keyword: bottled water vs filtered water • Meta description: Bottled water can cost hundreds of times more than filtered tap — and may contain more plastic. Here's the honest comparison on health, cost, and environmental impact.</w:t>
+          <w:b/>
+        </w:rPr>
+        <w:t xml:space="preserve">SEO Title:</w:t>
+      </w:r>
+      <w:r>
+        <w:rPr/>
+        <w:t xml:space="preserve"> Bottled Water vs. Filtered Tap: Cost, Health &amp; Eco </w:t>
+      </w:r>
+      <w:r>
+        <w:rPr>
+          <w:b/>
+        </w:rPr>
+        <w:t xml:space="preserve">URL Slug:</w:t>
+      </w:r>
+      <w:r>
+        <w:rPr/>
+        <w:t xml:space="preserve"> </w:t>
+      </w:r>
+      <w:r>
+        <w:rPr>
+          <w:rFonts w:ascii="Consolas" w:hAnsi="Consolas"/>
+          <w:sz w:val="20"/>
+          <w:shd w:val="clear" w:color="auto" w:fill="F2F2F2"/>
+        </w:rPr>
+        <w:t xml:space="preserve">/bottled-water-vs-filtered-tap-water</w:t>
+      </w:r>
+      <w:r>
+        <w:rPr/>
+        <w:t xml:space="preserve"> </w:t>
+      </w:r>
+      <w:r>
+        <w:rPr>
+          <w:b/>
+        </w:rPr>
+        <w:t xml:space="preserve">Meta Description:</w:t>
+      </w:r>
+      <w:r>
+        <w:rPr/>
+        <w:t xml:space="preserve"> Bottled water can cost hundreds of times more than filtered tap — and may contain more plastic. The honest comparison on health, cost, and the environment. </w:t>
+      </w:r>
+      <w:r>
+        <w:rPr>
+          <w:b/>
+        </w:rPr>
+        <w:t xml:space="preserve">Focus Keyword:</w:t>
+      </w:r>
+      <w:r>
+        <w:rPr/>
+        <w:t xml:space="preserve"> bottled water vs filtered water </w:t>
+      </w:r>
+      <w:r>
+        <w:rPr>
+          <w:b/>
+        </w:rPr>
+        <w:t xml:space="preserve">Secondary Keywords:</w:t>
+      </w:r>
+      <w:r>
+        <w:rPr/>
+        <w:t xml:space="preserve"> is bottled water better than tap, cost of bottled water vs filter, bottled water microplastics </w:t>
+      </w:r>
+      <w:r>
+        <w:rPr>
+          <w:b/>
+        </w:rPr>
+        <w:t xml:space="preserve">LSI / Semantic Keywords:</w:t>
+      </w:r>
+      <w:r>
+        <w:rPr/>
+        <w:t xml:space="preserve"> nanoplastics in bottled water, cost per gallon, plastic waste, single-use bottles, point-of-use filtration savings </w:t>
+      </w:r>
+      <w:r>
+        <w:rPr>
+          <w:b/>
+        </w:rPr>
+        <w:t xml:space="preserve">Image Alt Text:</w:t>
+      </w:r>
+      <w:r>
+        <w:rPr/>
+        <w:t xml:space="preserve"> Side-by-side comparison of a year of bottled water cost and plastic waste versus one home filtration system</w:t>
       </w:r>
     </w:p>
     <w:p>
@@ -11440,9 +12828,85 @@
     <w:p>
       <w:r>
         <w:rPr>
-          <w:i/>
-        </w:rPr>
-        <w:t xml:space="preserve">Focus keyword: filtered water for pets • Meta description: Is tap water safe for your dog or cat? Learn how chlorine and minerals affect pets, when filtered water helps, and how to keep your animals hydrated and healthy.</w:t>
+          <w:b/>
+        </w:rPr>
+        <w:t xml:space="preserve">SEO Title:</w:t>
+      </w:r>
+      <w:r>
+        <w:rPr/>
+        <w:t xml:space="preserve"> Should Pets Drink Filtered Water? Dog &amp; Cat Guide </w:t>
+      </w:r>
+      <w:r>
+        <w:rPr>
+          <w:b/>
+        </w:rPr>
+        <w:t xml:space="preserve">URL Slug:</w:t>
+      </w:r>
+      <w:r>
+        <w:rPr/>
+        <w:t xml:space="preserve"> </w:t>
+      </w:r>
+      <w:r>
+        <w:rPr>
+          <w:rFonts w:ascii="Consolas" w:hAnsi="Consolas"/>
+          <w:sz w:val="20"/>
+          <w:shd w:val="clear" w:color="auto" w:fill="F2F2F2"/>
+        </w:rPr>
+        <w:t xml:space="preserve">/filtered-water-for-pets-dogs-cats</w:t>
+      </w:r>
+      <w:r>
+        <w:rPr/>
+        <w:t xml:space="preserve"> </w:t>
+      </w:r>
+      <w:r>
+        <w:rPr>
+          <w:b/>
+        </w:rPr>
+        <w:t xml:space="preserve">Meta Description:</w:t>
+      </w:r>
+      <w:r>
+        <w:rPr/>
+        <w:t xml:space="preserve"> Is tap water safe for your dog or cat? Learn how chlorine and minerals affect pets, when filtered water helps, and how to keep your animals healthy. </w:t>
+      </w:r>
+      <w:r>
+        <w:rPr>
+          <w:b/>
+        </w:rPr>
+        <w:t xml:space="preserve">Focus Keyword:</w:t>
+      </w:r>
+      <w:r>
+        <w:rPr/>
+        <w:t xml:space="preserve"> filtered water for pets </w:t>
+      </w:r>
+      <w:r>
+        <w:rPr>
+          <w:b/>
+        </w:rPr>
+        <w:t xml:space="preserve">Secondary Keywords:</w:t>
+      </w:r>
+      <w:r>
+        <w:rPr/>
+        <w:t xml:space="preserve"> is tap water safe for dogs, best water for cats, should dogs drink filtered water, hard water and pets </w:t>
+      </w:r>
+      <w:r>
+        <w:rPr>
+          <w:b/>
+        </w:rPr>
+        <w:t xml:space="preserve">LSI / Semantic Keywords:</w:t>
+      </w:r>
+      <w:r>
+        <w:rPr/>
+        <w:t xml:space="preserve"> chlorine and pets, urinary crystals in cats, mineral content, pet hydration, sensitive stomach </w:t>
+      </w:r>
+      <w:r>
+        <w:rPr>
+          <w:b/>
+        </w:rPr>
+        <w:t xml:space="preserve">Image Alt Text:</w:t>
+      </w:r>
+      <w:r>
+        <w:rPr/>
+        <w:t xml:space="preserve"> Illustration comparing a pet water bowl filled with unfiltered tap water versus filtered water</w:t>
       </w:r>
     </w:p>
     <w:p>
@@ -11857,9 +13321,85 @@
     <w:p>
       <w:r>
         <w:rPr>
-          <w:i/>
-        </w:rPr>
-        <w:t xml:space="preserve">Focus keyword: best water for coffee • Meta description: Great coffee is mostly water. Learn how minerals, chlorine, and hardness change flavor — and how the right filtered water transforms your coffee, tea, and cooking.</w:t>
+          <w:b/>
+        </w:rPr>
+        <w:t xml:space="preserve">SEO Title:</w:t>
+      </w:r>
+      <w:r>
+        <w:rPr/>
+        <w:t xml:space="preserve"> The Best Water for Coffee, Tea &amp; Cooking </w:t>
+      </w:r>
+      <w:r>
+        <w:rPr>
+          <w:b/>
+        </w:rPr>
+        <w:t xml:space="preserve">URL Slug:</w:t>
+      </w:r>
+      <w:r>
+        <w:rPr/>
+        <w:t xml:space="preserve"> </w:t>
+      </w:r>
+      <w:r>
+        <w:rPr>
+          <w:rFonts w:ascii="Consolas" w:hAnsi="Consolas"/>
+          <w:sz w:val="20"/>
+          <w:shd w:val="clear" w:color="auto" w:fill="F2F2F2"/>
+        </w:rPr>
+        <w:t xml:space="preserve">/best-water-for-coffee-tea-cooking</w:t>
+      </w:r>
+      <w:r>
+        <w:rPr/>
+        <w:t xml:space="preserve"> </w:t>
+      </w:r>
+      <w:r>
+        <w:rPr>
+          <w:b/>
+        </w:rPr>
+        <w:t xml:space="preserve">Meta Description:</w:t>
+      </w:r>
+      <w:r>
+        <w:rPr/>
+        <w:t xml:space="preserve"> Great coffee is mostly water. Learn how minerals, chlorine, and hardness change flavor — and how the right filtered water transforms your brew and cooking. </w:t>
+      </w:r>
+      <w:r>
+        <w:rPr>
+          <w:b/>
+        </w:rPr>
+        <w:t xml:space="preserve">Focus Keyword:</w:t>
+      </w:r>
+      <w:r>
+        <w:rPr/>
+        <w:t xml:space="preserve"> best water for coffee </w:t>
+      </w:r>
+      <w:r>
+        <w:rPr>
+          <w:b/>
+        </w:rPr>
+        <w:t xml:space="preserve">Secondary Keywords:</w:t>
+      </w:r>
+      <w:r>
+        <w:rPr/>
+        <w:t xml:space="preserve"> water for tea, does water affect coffee taste, filtered water for cooking, hard water coffee maker </w:t>
+      </w:r>
+      <w:r>
+        <w:rPr>
+          <w:b/>
+        </w:rPr>
+        <w:t xml:space="preserve">LSI / Semantic Keywords:</w:t>
+      </w:r>
+      <w:r>
+        <w:rPr/>
+        <w:t xml:space="preserve"> TDS for coffee, mineral balance extraction, chlorine off-flavors, scale in coffee maker, brewing water </w:t>
+      </w:r>
+      <w:r>
+        <w:rPr>
+          <w:b/>
+        </w:rPr>
+        <w:t xml:space="preserve">Image Alt Text:</w:t>
+      </w:r>
+      <w:r>
+        <w:rPr/>
+        <w:t xml:space="preserve"> Flavor wheel showing how chlorine, hardness, and TDS affect coffee taste with the ideal brewing-water zone highlighted</w:t>
       </w:r>
     </w:p>
     <w:p>
@@ -12163,9 +13703,85 @@
     <w:p>
       <w:r>
         <w:rPr>
-          <w:i/>
-        </w:rPr>
-        <w:t xml:space="preserve">Focus keyword: water filtration system maintenance • Meta description: Keep your water system performing like new. This complete maintenance schedule covers filters, softeners, and RO units — what to do monthly, yearly, and beyond.</w:t>
+          <w:b/>
+        </w:rPr>
+        <w:t xml:space="preserve">SEO Title:</w:t>
+      </w:r>
+      <w:r>
+        <w:rPr/>
+        <w:t xml:space="preserve"> Water Filtration System Maintenance Schedule </w:t>
+      </w:r>
+      <w:r>
+        <w:rPr>
+          <w:b/>
+        </w:rPr>
+        <w:t xml:space="preserve">URL Slug:</w:t>
+      </w:r>
+      <w:r>
+        <w:rPr/>
+        <w:t xml:space="preserve"> </w:t>
+      </w:r>
+      <w:r>
+        <w:rPr>
+          <w:rFonts w:ascii="Consolas" w:hAnsi="Consolas"/>
+          <w:sz w:val="20"/>
+          <w:shd w:val="clear" w:color="auto" w:fill="F2F2F2"/>
+        </w:rPr>
+        <w:t xml:space="preserve">/water-filtration-system-maintenance-schedule</w:t>
+      </w:r>
+      <w:r>
+        <w:rPr/>
+        <w:t xml:space="preserve"> </w:t>
+      </w:r>
+      <w:r>
+        <w:rPr>
+          <w:b/>
+        </w:rPr>
+        <w:t xml:space="preserve">Meta Description:</w:t>
+      </w:r>
+      <w:r>
+        <w:rPr/>
+        <w:t xml:space="preserve"> Keep your water system performing like new. A complete maintenance schedule for filters, softeners, and RO units — what to do monthly, yearly, and beyond. </w:t>
+      </w:r>
+      <w:r>
+        <w:rPr>
+          <w:b/>
+        </w:rPr>
+        <w:t xml:space="preserve">Focus Keyword:</w:t>
+      </w:r>
+      <w:r>
+        <w:rPr/>
+        <w:t xml:space="preserve"> water filtration system maintenance </w:t>
+      </w:r>
+      <w:r>
+        <w:rPr>
+          <w:b/>
+        </w:rPr>
+        <w:t xml:space="preserve">Secondary Keywords:</w:t>
+      </w:r>
+      <w:r>
+        <w:rPr/>
+        <w:t xml:space="preserve"> how often to change water filter, water softener maintenance, RO filter replacement schedule, whole house filter maintenance </w:t>
+      </w:r>
+      <w:r>
+        <w:rPr>
+          <w:b/>
+        </w:rPr>
+        <w:t xml:space="preserve">LSI / Semantic Keywords:</w:t>
+      </w:r>
+      <w:r>
+        <w:rPr/>
+        <w:t xml:space="preserve"> filter cartridge lifespan, sediment pre-filter, brine tank, membrane replacement, pressure drop, sanitizing </w:t>
+      </w:r>
+      <w:r>
+        <w:rPr>
+          <w:b/>
+        </w:rPr>
+        <w:t xml:space="preserve">Image Alt Text:</w:t>
+      </w:r>
+      <w:r>
+        <w:rPr/>
+        <w:t xml:space="preserve"> Printable annual water system maintenance calendar by system type for filters, softeners, and reverse osmosis</w:t>
       </w:r>
     </w:p>
     <w:p>
@@ -12911,9 +14527,85 @@
     <w:p>
       <w:r>
         <w:rPr>
-          <w:i/>
-        </w:rPr>
-        <w:t xml:space="preserve">Focus keyword: NSF certified water filter • Meta description: "NSF certified" gets thrown around loosely. Learn what NSF/ANSI 42, 53, 58, and 401 actually certify — and how to verify a filter's real contaminant-reduction claims.</w:t>
+          <w:b/>
+        </w:rPr>
+        <w:t xml:space="preserve">SEO Title:</w:t>
+      </w:r>
+      <w:r>
+        <w:rPr/>
+        <w:t xml:space="preserve"> Water Filter Certifications: NSF/ANSI Standards Explained </w:t>
+      </w:r>
+      <w:r>
+        <w:rPr>
+          <w:b/>
+        </w:rPr>
+        <w:t xml:space="preserve">URL Slug:</w:t>
+      </w:r>
+      <w:r>
+        <w:rPr/>
+        <w:t xml:space="preserve"> </w:t>
+      </w:r>
+      <w:r>
+        <w:rPr>
+          <w:rFonts w:ascii="Consolas" w:hAnsi="Consolas"/>
+          <w:sz w:val="20"/>
+          <w:shd w:val="clear" w:color="auto" w:fill="F2F2F2"/>
+        </w:rPr>
+        <w:t xml:space="preserve">/water-filter-certifications-nsf-ansi-explained</w:t>
+      </w:r>
+      <w:r>
+        <w:rPr/>
+        <w:t xml:space="preserve"> </w:t>
+      </w:r>
+      <w:r>
+        <w:rPr>
+          <w:b/>
+        </w:rPr>
+        <w:t xml:space="preserve">Meta Description:</w:t>
+      </w:r>
+      <w:r>
+        <w:rPr/>
+        <w:t xml:space="preserve"> "NSF certified" gets thrown around loosely. Learn what NSF/ANSI 42, 53, 58, and 401 actually certify — and how to verify a filter's real claims. </w:t>
+      </w:r>
+      <w:r>
+        <w:rPr>
+          <w:b/>
+        </w:rPr>
+        <w:t xml:space="preserve">Focus Keyword:</w:t>
+      </w:r>
+      <w:r>
+        <w:rPr/>
+        <w:t xml:space="preserve"> NSF certified water filter </w:t>
+      </w:r>
+      <w:r>
+        <w:rPr>
+          <w:b/>
+        </w:rPr>
+        <w:t xml:space="preserve">Secondary Keywords:</w:t>
+      </w:r>
+      <w:r>
+        <w:rPr/>
+        <w:t xml:space="preserve"> NSF ANSI standards water, what does NSF 53 mean, water filter certification, WQA gold seal </w:t>
+      </w:r>
+      <w:r>
+        <w:rPr>
+          <w:b/>
+        </w:rPr>
+        <w:t xml:space="preserve">LSI / Semantic Keywords:</w:t>
+      </w:r>
+      <w:r>
+        <w:rPr/>
+        <w:t xml:space="preserve"> NSF/ANSI 42, 53, 58, 401, contaminant reduction claims, third-party testing, certified vs tested to, performance data sheet </w:t>
+      </w:r>
+      <w:r>
+        <w:rPr>
+          <w:b/>
+        </w:rPr>
+        <w:t xml:space="preserve">Image Alt Text:</w:t>
+      </w:r>
+      <w:r>
+        <w:rPr/>
+        <w:t xml:space="preserve"> Decoder card matching NSF/ANSI standards 42, 53, 58, and 401 to the contaminants each one certifies a filter to reduce</w:t>
       </w:r>
     </w:p>
     <w:p>
@@ -13354,9 +15046,85 @@
     <w:p>
       <w:r>
         <w:rPr>
-          <w:i/>
-        </w:rPr>
-        <w:t xml:space="preserve">Focus keyword: how water filtration works • Meta description: From activated carbon to reverse osmosis and TAC, here's how each water filtration technology works — and what "NASA-grade" filtration really brings to your home.</w:t>
+          <w:b/>
+        </w:rPr>
+        <w:t xml:space="preserve">SEO Title:</w:t>
+      </w:r>
+      <w:r>
+        <w:rPr/>
+        <w:t xml:space="preserve"> NASA-Grade Water Filtration Technology, Explained </w:t>
+      </w:r>
+      <w:r>
+        <w:rPr>
+          <w:b/>
+        </w:rPr>
+        <w:t xml:space="preserve">URL Slug:</w:t>
+      </w:r>
+      <w:r>
+        <w:rPr/>
+        <w:t xml:space="preserve"> </w:t>
+      </w:r>
+      <w:r>
+        <w:rPr>
+          <w:rFonts w:ascii="Consolas" w:hAnsi="Consolas"/>
+          <w:sz w:val="20"/>
+          <w:shd w:val="clear" w:color="auto" w:fill="F2F2F2"/>
+        </w:rPr>
+        <w:t xml:space="preserve">/nasa-grade-water-filtration-technology-explained</w:t>
+      </w:r>
+      <w:r>
+        <w:rPr/>
+        <w:t xml:space="preserve"> </w:t>
+      </w:r>
+      <w:r>
+        <w:rPr>
+          <w:b/>
+        </w:rPr>
+        <w:t xml:space="preserve">Meta Description:</w:t>
+      </w:r>
+      <w:r>
+        <w:rPr/>
+        <w:t xml:space="preserve"> From activated carbon to reverse osmosis and TAC, here's how each water filtration technology works — and what "NASA-grade" filtration brings to your home. </w:t>
+      </w:r>
+      <w:r>
+        <w:rPr>
+          <w:b/>
+        </w:rPr>
+        <w:t xml:space="preserve">Focus Keyword:</w:t>
+      </w:r>
+      <w:r>
+        <w:rPr/>
+        <w:t xml:space="preserve"> how water filtration works </w:t>
+      </w:r>
+      <w:r>
+        <w:rPr>
+          <w:b/>
+        </w:rPr>
+        <w:t xml:space="preserve">Secondary Keywords:</w:t>
+      </w:r>
+      <w:r>
+        <w:rPr/>
+        <w:t xml:space="preserve"> types of water filtration technology, activated carbon vs KDF, water filtration media explained, NASA water filtration </w:t>
+      </w:r>
+      <w:r>
+        <w:rPr>
+          <w:b/>
+        </w:rPr>
+        <w:t xml:space="preserve">LSI / Semantic Keywords:</w:t>
+      </w:r>
+      <w:r>
+        <w:rPr/>
+        <w:t xml:space="preserve"> granular activated carbon, catalytic carbon, KDF media, template-assisted crystallization, reverse osmosis membrane, multi-stage filtration, adsorption </w:t>
+      </w:r>
+      <w:r>
+        <w:rPr>
+          <w:b/>
+        </w:rPr>
+        <w:t xml:space="preserve">Image Alt Text:</w:t>
+      </w:r>
+      <w:r>
+        <w:rPr/>
+        <w:t xml:space="preserve"> Layered diagram of multi-stage water filtration showing what carbon, KDF, TAC, and reverse osmosis each remove</w:t>
       </w:r>
     </w:p>
     <w:p>
@@ -13690,9 +15458,85 @@
     <w:p>
       <w:r>
         <w:rPr>
-          <w:i/>
-        </w:rPr>
-        <w:t xml:space="preserve">Focus keyword: whole house water filter installation • Meta description: Wondering what whole-house water system installation involves? Here's the step-by-step process, timeline, permits, and why professional installation protects your investment.</w:t>
+          <w:b/>
+        </w:rPr>
+        <w:t xml:space="preserve">SEO Title:</w:t>
+      </w:r>
+      <w:r>
+        <w:rPr/>
+        <w:t xml:space="preserve"> Whole-House Water System Installation: What to Expect </w:t>
+      </w:r>
+      <w:r>
+        <w:rPr>
+          <w:b/>
+        </w:rPr>
+        <w:t xml:space="preserve">URL Slug:</w:t>
+      </w:r>
+      <w:r>
+        <w:rPr/>
+        <w:t xml:space="preserve"> </w:t>
+      </w:r>
+      <w:r>
+        <w:rPr>
+          <w:rFonts w:ascii="Consolas" w:hAnsi="Consolas"/>
+          <w:sz w:val="20"/>
+          <w:shd w:val="clear" w:color="auto" w:fill="F2F2F2"/>
+        </w:rPr>
+        <w:t xml:space="preserve">/water-filtration-installation-guide-what-to-expect</w:t>
+      </w:r>
+      <w:r>
+        <w:rPr/>
+        <w:t xml:space="preserve"> </w:t>
+      </w:r>
+      <w:r>
+        <w:rPr>
+          <w:b/>
+        </w:rPr>
+        <w:t xml:space="preserve">Meta Description:</w:t>
+      </w:r>
+      <w:r>
+        <w:rPr/>
+        <w:t xml:space="preserve"> Wondering what whole-house water system installation involves? The step-by-step process, timeline, permits, and why professional installation protects you. </w:t>
+      </w:r>
+      <w:r>
+        <w:rPr>
+          <w:b/>
+        </w:rPr>
+        <w:t xml:space="preserve">Focus Keyword:</w:t>
+      </w:r>
+      <w:r>
+        <w:rPr/>
+        <w:t xml:space="preserve"> whole house water filter installation </w:t>
+      </w:r>
+      <w:r>
+        <w:rPr>
+          <w:b/>
+        </w:rPr>
+        <w:t xml:space="preserve">Secondary Keywords:</w:t>
+      </w:r>
+      <w:r>
+        <w:rPr/>
+        <w:t xml:space="preserve"> water softener installation, how is a water filtration system installed, water system installation cost, point of entry installation </w:t>
+      </w:r>
+      <w:r>
+        <w:rPr>
+          <w:b/>
+        </w:rPr>
+        <w:t xml:space="preserve">LSI / Semantic Keywords:</w:t>
+      </w:r>
+      <w:r>
+        <w:rPr/>
+        <w:t xml:space="preserve"> main water line, bypass valve, drain line, professional vs DIY install, permits, plumbing connection, installation timeline </w:t>
+      </w:r>
+      <w:r>
+        <w:rPr>
+          <w:b/>
+        </w:rPr>
+        <w:t xml:space="preserve">Image Alt Text:</w:t>
+      </w:r>
+      <w:r>
+        <w:rPr/>
+        <w:t xml:space="preserve"> Installation-day timeline showing the steps of installing a whole-house water system at the point of entry</w:t>
       </w:r>
     </w:p>
     <w:p>
@@ -14140,9 +15984,85 @@
     <w:p>
       <w:r>
         <w:rPr>
-          <w:i/>
-        </w:rPr>
-        <w:t xml:space="preserve">Focus keyword: US water quality by region • Meta description: Water problems differ dramatically across America. Explore the most common contaminants and hardness issues by region — and the right treatment for where you live.</w:t>
+          <w:b/>
+        </w:rPr>
+        <w:t xml:space="preserve">SEO Title:</w:t>
+      </w:r>
+      <w:r>
+        <w:rPr/>
+        <w:t xml:space="preserve"> U.S. Water Quality by Region: A Complete Guide </w:t>
+      </w:r>
+      <w:r>
+        <w:rPr>
+          <w:b/>
+        </w:rPr>
+        <w:t xml:space="preserve">URL Slug:</w:t>
+      </w:r>
+      <w:r>
+        <w:rPr/>
+        <w:t xml:space="preserve"> </w:t>
+      </w:r>
+      <w:r>
+        <w:rPr>
+          <w:rFonts w:ascii="Consolas" w:hAnsi="Consolas"/>
+          <w:sz w:val="20"/>
+          <w:shd w:val="clear" w:color="auto" w:fill="F2F2F2"/>
+        </w:rPr>
+        <w:t xml:space="preserve">/us-water-quality-by-region-guide</w:t>
+      </w:r>
+      <w:r>
+        <w:rPr/>
+        <w:t xml:space="preserve"> </w:t>
+      </w:r>
+      <w:r>
+        <w:rPr>
+          <w:b/>
+        </w:rPr>
+        <w:t xml:space="preserve">Meta Description:</w:t>
+      </w:r>
+      <w:r>
+        <w:rPr/>
+        <w:t xml:space="preserve"> Water problems differ dramatically across America. Explore the most common contaminants and hardness issues by region — and the right treatment for you. </w:t>
+      </w:r>
+      <w:r>
+        <w:rPr>
+          <w:b/>
+        </w:rPr>
+        <w:t xml:space="preserve">Focus Keyword:</w:t>
+      </w:r>
+      <w:r>
+        <w:rPr/>
+        <w:t xml:space="preserve"> US water quality by region </w:t>
+      </w:r>
+      <w:r>
+        <w:rPr>
+          <w:b/>
+        </w:rPr>
+        <w:t xml:space="preserve">Secondary Keywords:</w:t>
+      </w:r>
+      <w:r>
+        <w:rPr/>
+        <w:t xml:space="preserve"> worst tap water in America, water quality by state, regional water problems, best and worst water cities </w:t>
+      </w:r>
+      <w:r>
+        <w:rPr>
+          <w:b/>
+        </w:rPr>
+        <w:t xml:space="preserve">LSI / Semantic Keywords:</w:t>
+      </w:r>
+      <w:r>
+        <w:rPr/>
+        <w:t xml:space="preserve"> hardness belt, agricultural runoff, aging infrastructure, lead service lines, arsenic Southwest, regional contaminants </w:t>
+      </w:r>
+      <w:r>
+        <w:rPr>
+          <w:b/>
+        </w:rPr>
+        <w:t xml:space="preserve">Image Alt Text:</w:t>
+      </w:r>
+      <w:r>
+        <w:rPr/>
+        <w:t xml:space="preserve"> Map of the United States showing the most common water contaminants and hardness issues by region</w:t>
       </w:r>
     </w:p>
     <w:p>

</xml_diff>

<commit_message>
Add inline citation hyperlinks + publishing calendar/checklist
- Upgraded build_docx.py to render real clickable Word hyperlinks (with external relationships); validated XML and link resolution

- Added 12 inline citation links to key verified stats across articles 1-6, 17, 18, 20, 22 (EPA, CDC, USGS, NOAA, NSF, EWG, Columbia/PNAS, SCA)

- New publishing checklist + 6-month content calendar (MD + DOCX): pre-launch setup, per-article checklist, week-by-week schedule, internal-linking map, KPIs
</commit_message>
<xml_diff>
--- a/WellnessWater-25-Pillar-Blog-Content.docx
+++ b/WellnessWater-25-Pillar-Blog-Content.docx
@@ -868,7 +868,20 @@
     <w:p>
       <w:r>
         <w:rPr/>
-        <w:t xml:space="preserve">For most of PFAS history there was no enforceable national limit for them in drinking water. That changed. In 2024, the EPA finalized the first-ever national drinking water standards for PFAS, setting enforceable limits for several compounds — including PFOA and PFOS — at just </w:t>
+        <w:t xml:space="preserve">For most of PFAS history there was no enforceable national limit for them in drinking water. That changed. In 2024, the EPA finalized </w:t>
+      </w:r>
+      <w:hyperlink r:id="rIdHl1">
+        <w:r>
+          <w:rPr>
+            <w:color w:val="0563C1"/>
+            <w:u w:val="single"/>
+          </w:rPr>
+          <w:t xml:space="preserve">the first-ever national drinking water standards for PFAS</w:t>
+        </w:r>
+      </w:hyperlink>
+      <w:r>
+        <w:rPr/>
+        <w:t xml:space="preserve">, setting enforceable limits for several compounds — including PFOA and PFOS — at just </w:t>
       </w:r>
       <w:r>
         <w:rPr>
@@ -1653,7 +1666,20 @@
     <w:p>
       <w:r>
         <w:rPr/>
-        <w:t xml:space="preserve">The CCR is mandated by the Safe Drinking Water Act. Every community water system in the U.S. must publish one each year, telling customers where their water comes from, what was detected in it, and how those levels compare to federal limits. It's a transparency tool — and a good one. But it was written by engineers and regulators, which is why it reads like a tax form.</w:t>
+        <w:t xml:space="preserve">The CCR is </w:t>
+      </w:r>
+      <w:hyperlink r:id="rIdHl2">
+        <w:r>
+          <w:rPr>
+            <w:color w:val="0563C1"/>
+            <w:u w:val="single"/>
+          </w:rPr>
+          <w:t xml:space="preserve">mandated by the Safe Drinking Water Act</w:t>
+        </w:r>
+      </w:hyperlink>
+      <w:r>
+        <w:rPr/>
+        <w:t xml:space="preserve">. Every community water system in the U.S. must publish one each year, telling customers where their water comes from, what was detected in it, and how those levels compare to federal limits. It's a transparency tool — and a good one. But it was written by engineers and regulators, which is why it reads like a tax form.</w:t>
       </w:r>
     </w:p>
     <w:p>
@@ -2231,9 +2257,18 @@
       </w:r>
     </w:p>
     <w:p>
-      <w:r>
-        <w:rPr/>
-        <w:t xml:space="preserve">More than 15 million U.S. households rely on private wells (CDC) — and that's not a reason for anxiety, it's a reason for a checklist. Here's exactly what to test for and how often.</w:t>
+      <w:hyperlink r:id="rIdHl3">
+        <w:r>
+          <w:rPr>
+            <w:color w:val="0563C1"/>
+            <w:u w:val="single"/>
+          </w:rPr>
+          <w:t xml:space="preserve">More than 15 million U.S. households rely on private wells</w:t>
+        </w:r>
+      </w:hyperlink>
+      <w:r>
+        <w:rPr/>
+        <w:t xml:space="preserve"> (CDC) — and that's not a reason for anxiety, it's a reason for a checklist. Here's exactly what to test for and how often.</w:t>
       </w:r>
     </w:p>
     <w:p>
@@ -3448,9 +3483,18 @@
       </w:r>
     </w:p>
     <w:p>
-      <w:r>
-        <w:rPr/>
-        <w:t xml:space="preserve">Microplastics are plastic particles smaller than five millimeters — roughly the size of a sesame seed down to invisible. </w:t>
+      <w:hyperlink r:id="rIdHl4">
+        <w:r>
+          <w:rPr>
+            <w:color w:val="0563C1"/>
+            <w:u w:val="single"/>
+          </w:rPr>
+          <w:t xml:space="preserve">Microplastics are plastic particles smaller than five millimeters</w:t>
+        </w:r>
+      </w:hyperlink>
+      <w:r>
+        <w:rPr/>
+        <w:t xml:space="preserve"> — roughly the size of a sesame seed down to invisible. </w:t>
       </w:r>
       <w:r>
         <w:rPr>
@@ -3485,7 +3529,20 @@
       </w:r>
       <w:r>
         <w:rPr/>
-        <w:t xml:space="preserve"> A widely reported 2024 study using advanced detection found bottled water contained hundreds of thousands of nanoplastic particles per liter — many times more than previous estimates. The plastic bottle and cap themselves shed particles, especially with heat and repeated handling.</w:t>
+        <w:t xml:space="preserve"> </w:t>
+      </w:r>
+      <w:hyperlink r:id="rIdHl5">
+        <w:r>
+          <w:rPr>
+            <w:color w:val="0563C1"/>
+            <w:u w:val="single"/>
+          </w:rPr>
+          <w:t xml:space="preserve">A widely reported 2024 study</w:t>
+        </w:r>
+      </w:hyperlink>
+      <w:r>
+        <w:rPr/>
+        <w:t xml:space="preserve"> using advanced detection found bottled water contained hundreds of thousands of nanoplastic particles per liter — many times more than previous estimates. The plastic bottle and cap themselves shed particles, especially with heat and repeated handling.</w:t>
       </w:r>
     </w:p>
     <w:p>
@@ -3954,7 +4011,20 @@
     <w:p>
       <w:r>
         <w:rPr/>
-        <w:t xml:space="preserve">Arsenic occurs naturally in many U.S. aquifers, particularly in parts of the West, Midwest, and Northeast. It has no taste, color, or smell, so well owners can be exposed for years unknowingly. The federal limit is 10 parts per billion, but the health goal is effectively zero, since long-term exposure is associated with serious health concerns. Reverse osmosis and certain specialty adsorptive media are the standard removal approaches.</w:t>
+        <w:t xml:space="preserve">Arsenic occurs naturally in many U.S. aquifers, particularly in parts of the West, Midwest, and Northeast. It has no taste, color, or smell, so well owners can be exposed for years unknowingly. </w:t>
+      </w:r>
+      <w:hyperlink r:id="rIdHl6">
+        <w:r>
+          <w:rPr>
+            <w:color w:val="0563C1"/>
+            <w:u w:val="single"/>
+          </w:rPr>
+          <w:t xml:space="preserve">The federal limit is 10 parts per billion</w:t>
+        </w:r>
+      </w:hyperlink>
+      <w:r>
+        <w:rPr/>
+        <w:t xml:space="preserve">, but the health goal is effectively zero, since long-term exposure is associated with serious health concerns. Reverse osmosis and certain specialty adsorptive media are the standard removal approaches.</w:t>
       </w:r>
     </w:p>
     <w:p>
@@ -4009,7 +4079,20 @@
       </w:r>
       <w:r>
         <w:rPr/>
-        <w:t xml:space="preserve"> tap. Health authorities recognize no safe level of lead exposure, and children are most vulnerable. Reverse osmosis and filters certified specifically for lead reduction are the dependable solutions.</w:t>
+        <w:t xml:space="preserve"> tap. </w:t>
+      </w:r>
+      <w:hyperlink r:id="rIdHl7">
+        <w:r>
+          <w:rPr>
+            <w:color w:val="0563C1"/>
+            <w:u w:val="single"/>
+          </w:rPr>
+          <w:t xml:space="preserve">Health authorities recognize no safe level of lead exposure</w:t>
+        </w:r>
+      </w:hyperlink>
+      <w:r>
+        <w:rPr/>
+        <w:t xml:space="preserve">, and children are most vulnerable. Reverse osmosis and filters certified specifically for lead reduction are the dependable solutions.</w:t>
       </w:r>
     </w:p>
     <w:p>
@@ -4486,7 +4569,20 @@
       </w:r>
       <w:r>
         <w:rPr/>
-        <w:t xml:space="preserve"> problem — and you're in very good company. An estimated 85% of American homes have hard water to some degree.</w:t>
+        <w:t xml:space="preserve"> problem — and you're in very good company. </w:t>
+      </w:r>
+      <w:hyperlink r:id="rIdHl8">
+        <w:r>
+          <w:rPr>
+            <w:color w:val="0563C1"/>
+            <w:u w:val="single"/>
+          </w:rPr>
+          <w:t xml:space="preserve">An estimated 85% of American homes have hard water</w:t>
+        </w:r>
+      </w:hyperlink>
+      <w:r>
+        <w:rPr/>
+        <w:t xml:space="preserve"> to some degree.</w:t>
       </w:r>
     </w:p>
     <w:p>
@@ -12217,7 +12313,20 @@
       </w:r>
       <w:r>
         <w:rPr/>
-        <w:t xml:space="preserve"> — the single biggest water concern for infants. High nitrate levels (common in agricultural and well-water areas) can interfere with an infant's blood oxygen, a condition known as "blue baby syndrome." Never mix formula with untested well water in farm country.</w:t>
+        <w:t xml:space="preserve"> — the single biggest water concern for infants. </w:t>
+      </w:r>
+      <w:hyperlink r:id="rIdHl9">
+        <w:r>
+          <w:rPr>
+            <w:color w:val="0563C1"/>
+            <w:u w:val="single"/>
+          </w:rPr>
+          <w:t xml:space="preserve">High nitrate levels</w:t>
+        </w:r>
+      </w:hyperlink>
+      <w:r>
+        <w:rPr/>
+        <w:t xml:space="preserve"> (common in agricultural and well-water areas) can interfere with an infant's blood oxygen, a condition known as "blue baby syndrome." Never mix formula with untested well water in farm country.</w:t>
       </w:r>
     </w:p>
     <w:p>
@@ -12654,7 +12763,20 @@
     <w:p>
       <w:r>
         <w:rPr/>
-        <w:t xml:space="preserve">Many assume bottled water is more tightly regulated and purer than tap. In reality, bottled water is regulated differently — and not always more strictly — and a meaningful share of bottled water is simply filtered municipal tap water in a plastic bottle. More striking, recent research using advanced detection found that </w:t>
+        <w:t xml:space="preserve">Many assume bottled water is more tightly regulated and purer than tap. In reality, bottled water is regulated differently — and not always more strictly — and a meaningful share of bottled water is simply filtered municipal tap water in a plastic bottle. More striking, </w:t>
+      </w:r>
+      <w:hyperlink r:id="rIdHl10">
+        <w:r>
+          <w:rPr>
+            <w:color w:val="0563C1"/>
+            <w:u w:val="single"/>
+          </w:rPr>
+          <w:t xml:space="preserve">recent research using advanced detection</w:t>
+        </w:r>
+      </w:hyperlink>
+      <w:r>
+        <w:rPr/>
+        <w:t xml:space="preserve"> found that </w:t>
       </w:r>
       <w:r>
         <w:rPr>
@@ -13555,7 +13677,20 @@
       </w:r>
       <w:r>
         <w:rPr/>
-        <w:t xml:space="preserve"> — enough minerals to extract well, but not so many (hard water) that they mute flavor and build scale. Specialty coffee organizations even publish ideal mineral ranges for brewing. A filtration setup that delivers balanced, chlorine-free water hits that sweet spot.</w:t>
+        <w:t xml:space="preserve"> — enough minerals to extract well, but not so many (hard water) that they mute flavor and build scale. </w:t>
+      </w:r>
+      <w:hyperlink r:id="rIdHl11">
+        <w:r>
+          <w:rPr>
+            <w:color w:val="0563C1"/>
+            <w:u w:val="single"/>
+          </w:rPr>
+          <w:t xml:space="preserve">Specialty coffee organizations even publish ideal mineral ranges</w:t>
+        </w:r>
+      </w:hyperlink>
+      <w:r>
+        <w:rPr/>
+        <w:t xml:space="preserve"> for brewing. A filtration setup that delivers balanced, chlorine-free water hits that sweet spot.</w:t>
       </w:r>
     </w:p>
     <w:p>
@@ -14928,7 +15063,20 @@
     <w:p>
       <w:r>
         <w:rPr/>
-        <w:t xml:space="preserve">You don't have to take anyone's word for it. Accredited certifiers (NSF and others) maintain public databases where you can search a product or company and see exactly what it's certified to reduce. If a product is truly certified, you'll find it listed with the specific standards and contaminant claims. If you can't find it, that absence is itself an answer.</w:t>
+        <w:t xml:space="preserve">You don't have to take anyone's word for it. </w:t>
+      </w:r>
+      <w:hyperlink r:id="rIdHl12">
+        <w:r>
+          <w:rPr>
+            <w:color w:val="0563C1"/>
+            <w:u w:val="single"/>
+          </w:rPr>
+          <w:t xml:space="preserve">Accredited certifiers (NSF and others)</w:t>
+        </w:r>
+      </w:hyperlink>
+      <w:r>
+        <w:rPr/>
+        <w:t xml:space="preserve"> maintain public databases where you can search a product or company and see exactly what it's certified to reduce. If a product is truly certified, you'll find it listed with the specific standards and contaminant claims. If you can't find it, that absence is itself an answer.</w:t>
       </w:r>
     </w:p>
     <w:p>

</xml_diff>